<commit_message>
Fix UPS commercial import named groups
</commit_message>
<xml_diff>
--- a/Hasil temuan audit cluade 12 sep26 9.49.docx
+++ b/Hasil temuan audit cluade 12 sep26 9.49.docx
@@ -2629,22 +2629,51 @@
       </w:r>
     </w:p>
     <w:p>
-      <w:r>
+      <w:pPr>
+        <w:rPr>
+          <w:lang w:val="pt-BR"/>
+        </w:rPr>
+      </w:pPr>
+      <w:r>
+        <w:rPr>
+          <w:lang w:val="pt-BR"/>
+        </w:rPr>
         <w:lastRenderedPageBreak/>
         <w:t>========================================</w:t>
       </w:r>
     </w:p>
     <w:p>
-      <w:r>
+      <w:pPr>
+        <w:rPr>
+          <w:lang w:val="pt-BR"/>
+        </w:rPr>
+      </w:pPr>
+      <w:r>
+        <w:rPr>
+          <w:lang w:val="pt-BR"/>
+        </w:rPr>
         <w:t>HASIL: 60 LULUS | 0 GAGAL dari 60 test</w:t>
       </w:r>
     </w:p>
     <w:p>
-      <w:r>
+      <w:pPr>
+        <w:rPr>
+          <w:lang w:val="pt-BR"/>
+        </w:rPr>
+      </w:pPr>
+      <w:r>
+        <w:rPr>
+          <w:lang w:val="pt-BR"/>
+        </w:rPr>
         <w:t>========================================</w:t>
       </w:r>
     </w:p>
     <w:p>
+      <w:pPr>
+        <w:pBdr>
+          <w:bottom w:val="single" w:sz="6" w:space="1" w:color="auto"/>
+        </w:pBdr>
+      </w:pPr>
       <w:r>
         <w:t>Seluruh 60 skenario pengujian biaya non-standard dan special handling telah terverifikasi </w:t>
       </w:r>
@@ -2657,6 +2686,615 @@
       </w:r>
       <w:r>
         <w:t>.</w:t>
+      </w:r>
+    </w:p>
+    <w:p>
+      <w:r>
+        <w:t xml:space="preserve">Saya sudah verifikasi ulang (bukan cuma baca dokumen, tapi jalankan kodenya langsung + bandingkan angka ke Python) semua 6 temuan di "Hasil temuan audit claude 12 sep26 9.47" terhadap </w:t>
+      </w:r>
+      <w:r>
+        <w:rPr>
+          <w:b/>
+          <w:bCs/>
+        </w:rPr>
+        <w:t>kondisi kode JS saat ini</w:t>
+      </w:r>
+      <w:r>
+        <w:t xml:space="preserve"> di zip ini. Statusnya sudah banyak berubah sejak dokumen itu ditulis — sebagian besar SUDAH diperbaiki, tapi ada satu yang </w:t>
+      </w:r>
+      <w:r>
+        <w:rPr>
+          <w:b/>
+          <w:bCs/>
+        </w:rPr>
+        <w:t>masih rusak</w:t>
+      </w:r>
+      <w:r>
+        <w:t>, hanya diperbaiki setengah:</w:t>
+      </w:r>
+    </w:p>
+    <w:p>
+      <w:pPr>
+        <w:rPr>
+          <w:b/>
+          <w:bCs/>
+        </w:rPr>
+      </w:pPr>
+      <w:r>
+        <w:rPr>
+          <w:rFonts w:ascii="Segoe UI Emoji" w:hAnsi="Segoe UI Emoji" w:cs="Segoe UI Emoji"/>
+          <w:b/>
+          <w:bCs/>
+        </w:rPr>
+        <w:t>🔴</w:t>
+      </w:r>
+      <w:r>
+        <w:rPr>
+          <w:b/>
+          <w:bCs/>
+        </w:rPr>
+        <w:t xml:space="preserve"> Masih rusak — UPS Commercial named-group (Kritis #1), diperbaiki TIDAK LENGKAP</w:t>
+      </w:r>
+    </w:p>
+    <w:p>
+      <w:r>
+        <w:t xml:space="preserve">Data tabelnya sudah benar (key "rest of china", "china south", "south korea taiwan vietnam", "japan" (sendiri, khusus import), "france germany italy united kingdom" semua ADA di commercial_data.js) — tapi fungsi getGroupKey() di rates/index.js itu </w:t>
+      </w:r>
+      <w:r>
+        <w:rPr>
+          <w:b/>
+          <w:bCs/>
+        </w:rPr>
+        <w:t>map hardcoded, TIDAK peduli arah (import/export)</w:t>
+      </w:r>
+      <w:r>
+        <w:t>, jadi salah untuk banyak kasus IMPORT. Saya buktikan dengan angka nyata:</w:t>
+      </w:r>
+    </w:p>
+    <w:tbl>
+      <w:tblPr>
+        <w:tblW w:w="0" w:type="auto"/>
+        <w:tblCellSpacing w:w="15" w:type="dxa"/>
+        <w:tblCellMar>
+          <w:top w:w="15" w:type="dxa"/>
+          <w:left w:w="15" w:type="dxa"/>
+          <w:bottom w:w="15" w:type="dxa"/>
+          <w:right w:w="15" w:type="dxa"/>
+        </w:tblCellMar>
+        <w:tblLook w:val="04A0" w:firstRow="1" w:lastRow="0" w:firstColumn="1" w:lastColumn="0" w:noHBand="0" w:noVBand="1"/>
+      </w:tblPr>
+      <w:tblGrid>
+        <w:gridCol w:w="2443"/>
+        <w:gridCol w:w="1346"/>
+        <w:gridCol w:w="1561"/>
+        <w:gridCol w:w="792"/>
+      </w:tblGrid>
+      <w:tr>
+        <w:trPr>
+          <w:tblHeader/>
+          <w:tblCellSpacing w:w="15" w:type="dxa"/>
+        </w:trPr>
+        <w:tc>
+          <w:tcPr>
+            <w:tcW w:w="0" w:type="auto"/>
+            <w:vAlign w:val="center"/>
+            <w:hideMark/>
+          </w:tcPr>
+          <w:p>
+            <w:pPr>
+              <w:rPr>
+                <w:b/>
+                <w:bCs/>
+              </w:rPr>
+            </w:pPr>
+            <w:r>
+              <w:rPr>
+                <w:b/>
+                <w:bCs/>
+              </w:rPr>
+              <w:t>Kasus</w:t>
+            </w:r>
+          </w:p>
+        </w:tc>
+        <w:tc>
+          <w:tcPr>
+            <w:tcW w:w="0" w:type="auto"/>
+            <w:vAlign w:val="center"/>
+            <w:hideMark/>
+          </w:tcPr>
+          <w:p>
+            <w:pPr>
+              <w:rPr>
+                <w:b/>
+                <w:bCs/>
+              </w:rPr>
+            </w:pPr>
+            <w:r>
+              <w:rPr>
+                <w:b/>
+                <w:bCs/>
+              </w:rPr>
+              <w:t>JS (sekarang)</w:t>
+            </w:r>
+          </w:p>
+        </w:tc>
+        <w:tc>
+          <w:tcPr>
+            <w:tcW w:w="0" w:type="auto"/>
+            <w:vAlign w:val="center"/>
+            <w:hideMark/>
+          </w:tcPr>
+          <w:p>
+            <w:pPr>
+              <w:rPr>
+                <w:b/>
+                <w:bCs/>
+              </w:rPr>
+            </w:pPr>
+            <w:r>
+              <w:rPr>
+                <w:b/>
+                <w:bCs/>
+              </w:rPr>
+              <w:t>Python (benar)</w:t>
+            </w:r>
+          </w:p>
+        </w:tc>
+        <w:tc>
+          <w:tcPr>
+            <w:tcW w:w="0" w:type="auto"/>
+            <w:vAlign w:val="center"/>
+            <w:hideMark/>
+          </w:tcPr>
+          <w:p>
+            <w:pPr>
+              <w:rPr>
+                <w:b/>
+                <w:bCs/>
+              </w:rPr>
+            </w:pPr>
+            <w:r>
+              <w:rPr>
+                <w:b/>
+                <w:bCs/>
+              </w:rPr>
+              <w:t>Selisih</w:t>
+            </w:r>
+          </w:p>
+        </w:tc>
+      </w:tr>
+      <w:tr>
+        <w:trPr>
+          <w:tblCellSpacing w:w="15" w:type="dxa"/>
+        </w:trPr>
+        <w:tc>
+          <w:tcPr>
+            <w:tcW w:w="0" w:type="auto"/>
+            <w:vAlign w:val="center"/>
+            <w:hideMark/>
+          </w:tcPr>
+          <w:p>
+            <w:r>
+              <w:t>Import saver Korea 2kg</w:t>
+            </w:r>
+          </w:p>
+        </w:tc>
+        <w:tc>
+          <w:tcPr>
+            <w:tcW w:w="0" w:type="auto"/>
+            <w:vAlign w:val="center"/>
+            <w:hideMark/>
+          </w:tcPr>
+          <w:p>
+            <w:r>
+              <w:t>Rp 633.100</w:t>
+            </w:r>
+          </w:p>
+        </w:tc>
+        <w:tc>
+          <w:tcPr>
+            <w:tcW w:w="0" w:type="auto"/>
+            <w:vAlign w:val="center"/>
+            <w:hideMark/>
+          </w:tcPr>
+          <w:p>
+            <w:r>
+              <w:t>Rp 580.300</w:t>
+            </w:r>
+          </w:p>
+        </w:tc>
+        <w:tc>
+          <w:tcPr>
+            <w:tcW w:w="0" w:type="auto"/>
+            <w:vAlign w:val="center"/>
+            <w:hideMark/>
+          </w:tcPr>
+          <w:p>
+            <w:r>
+              <w:t>+9.1%</w:t>
+            </w:r>
+          </w:p>
+        </w:tc>
+      </w:tr>
+      <w:tr>
+        <w:trPr>
+          <w:tblCellSpacing w:w="15" w:type="dxa"/>
+        </w:trPr>
+        <w:tc>
+          <w:tcPr>
+            <w:tcW w:w="0" w:type="auto"/>
+            <w:vAlign w:val="center"/>
+            <w:hideMark/>
+          </w:tcPr>
+          <w:p>
+            <w:r>
+              <w:t>Import saver Taiwan 2kg</w:t>
+            </w:r>
+          </w:p>
+        </w:tc>
+        <w:tc>
+          <w:tcPr>
+            <w:tcW w:w="0" w:type="auto"/>
+            <w:vAlign w:val="center"/>
+            <w:hideMark/>
+          </w:tcPr>
+          <w:p>
+            <w:r>
+              <w:t>Rp 633.100</w:t>
+            </w:r>
+          </w:p>
+        </w:tc>
+        <w:tc>
+          <w:tcPr>
+            <w:tcW w:w="0" w:type="auto"/>
+            <w:vAlign w:val="center"/>
+            <w:hideMark/>
+          </w:tcPr>
+          <w:p>
+            <w:r>
+              <w:t>Rp 580.300</w:t>
+            </w:r>
+          </w:p>
+        </w:tc>
+        <w:tc>
+          <w:tcPr>
+            <w:tcW w:w="0" w:type="auto"/>
+            <w:vAlign w:val="center"/>
+            <w:hideMark/>
+          </w:tcPr>
+          <w:p>
+            <w:r>
+              <w:t>+9.1%</w:t>
+            </w:r>
+          </w:p>
+        </w:tc>
+      </w:tr>
+      <w:tr>
+        <w:trPr>
+          <w:tblCellSpacing w:w="15" w:type="dxa"/>
+        </w:trPr>
+        <w:tc>
+          <w:tcPr>
+            <w:tcW w:w="0" w:type="auto"/>
+            <w:vAlign w:val="center"/>
+            <w:hideMark/>
+          </w:tcPr>
+          <w:p>
+            <w:r>
+              <w:t>Import saver UK 2kg</w:t>
+            </w:r>
+          </w:p>
+        </w:tc>
+        <w:tc>
+          <w:tcPr>
+            <w:tcW w:w="0" w:type="auto"/>
+            <w:vAlign w:val="center"/>
+            <w:hideMark/>
+          </w:tcPr>
+          <w:p>
+            <w:r>
+              <w:t>Rp 662.900</w:t>
+            </w:r>
+          </w:p>
+        </w:tc>
+        <w:tc>
+          <w:tcPr>
+            <w:tcW w:w="0" w:type="auto"/>
+            <w:vAlign w:val="center"/>
+            <w:hideMark/>
+          </w:tcPr>
+          <w:p>
+            <w:r>
+              <w:t>Rp 641.400</w:t>
+            </w:r>
+          </w:p>
+        </w:tc>
+        <w:tc>
+          <w:tcPr>
+            <w:tcW w:w="0" w:type="auto"/>
+            <w:vAlign w:val="center"/>
+            <w:hideMark/>
+          </w:tcPr>
+          <w:p>
+            <w:r>
+              <w:t>+3.4%</w:t>
+            </w:r>
+          </w:p>
+        </w:tc>
+      </w:tr>
+      <w:tr>
+        <w:trPr>
+          <w:tblCellSpacing w:w="15" w:type="dxa"/>
+        </w:trPr>
+        <w:tc>
+          <w:tcPr>
+            <w:tcW w:w="0" w:type="auto"/>
+            <w:vAlign w:val="center"/>
+            <w:hideMark/>
+          </w:tcPr>
+          <w:p>
+            <w:r>
+              <w:t>Import saver Jepang 2kg</w:t>
+            </w:r>
+          </w:p>
+        </w:tc>
+        <w:tc>
+          <w:tcPr>
+            <w:tcW w:w="0" w:type="auto"/>
+            <w:vAlign w:val="center"/>
+            <w:hideMark/>
+          </w:tcPr>
+          <w:p>
+            <w:r>
+              <w:t>Rp 594.700</w:t>
+            </w:r>
+          </w:p>
+        </w:tc>
+        <w:tc>
+          <w:tcPr>
+            <w:tcW w:w="0" w:type="auto"/>
+            <w:vAlign w:val="center"/>
+            <w:hideMark/>
+          </w:tcPr>
+          <w:p>
+            <w:r>
+              <w:t>Rp 535.300</w:t>
+            </w:r>
+          </w:p>
+        </w:tc>
+        <w:tc>
+          <w:tcPr>
+            <w:tcW w:w="0" w:type="auto"/>
+            <w:vAlign w:val="center"/>
+            <w:hideMark/>
+          </w:tcPr>
+          <w:p>
+            <w:r>
+              <w:t>+11.1%</w:t>
+            </w:r>
+          </w:p>
+        </w:tc>
+      </w:tr>
+    </w:tbl>
+    <w:p>
+      <w:r>
+        <w:t>Root cause: getGroupKey('japan') selalu balikin 'japan, korea, taiwan' (grup EXPORT), padahal untuk IMPORT harusnya 'japan' sendirian (tabel beda). UK grup import ('france germany italy united kingdom') malah tidak ada di map sama sekali. Juga ada bug kecil: 'china' di-map ke 'china' padahal key aslinya 'rest of china' — saat ini kebetulan tidak kelihatan karena angkanya sama persis dengan zone 3, tapi ini rapuh (bisa pecah kalau datanya diupdate).</w:t>
+      </w:r>
+    </w:p>
+    <w:p>
+      <w:pPr>
+        <w:rPr>
+          <w:b/>
+          <w:bCs/>
+          <w:lang w:val="pt-BR"/>
+        </w:rPr>
+      </w:pPr>
+      <w:r>
+        <w:rPr>
+          <w:rFonts w:ascii="Segoe UI Emoji" w:hAnsi="Segoe UI Emoji" w:cs="Segoe UI Emoji"/>
+          <w:b/>
+          <w:bCs/>
+          <w:lang w:val="pt-BR"/>
+        </w:rPr>
+        <w:t>✅</w:t>
+      </w:r>
+      <w:r>
+        <w:rPr>
+          <w:b/>
+          <w:bCs/>
+          <w:lang w:val="pt-BR"/>
+        </w:rPr>
+        <w:t xml:space="preserve"> Sudah benar-benar diperbaiki (saya verifikasi, bukan cuma baca komentar kode)</w:t>
+      </w:r>
+    </w:p>
+    <w:p>
+      <w:pPr>
+        <w:numPr>
+          <w:ilvl w:val="0"/>
+          <w:numId w:val="4"/>
+        </w:numPr>
+      </w:pPr>
+      <w:r>
+        <w:rPr>
+          <w:b/>
+          <w:bCs/>
+          <w:lang w:val="pt-BR"/>
+        </w:rPr>
+        <w:t>ODA/OPA (Kritis #2)</w:t>
+      </w:r>
+      <w:r>
+        <w:rPr>
+          <w:lang w:val="pt-BR"/>
+        </w:rPr>
+        <w:t xml:space="preserve"> — saya tes ulang skenario yang sama persis dari dokumen audit (Jakarta 14510, OPA): hasilnya Rp 339.000, cocok. </w:t>
+      </w:r>
+      <w:r>
+        <w:t xml:space="preserve">Data 67rb+ baris sudah ter-port ke </w:t>
+      </w:r>
+      <w:r>
+        <w:lastRenderedPageBreak/>
+        <w:t>oda_opa_data.json (5MB), plus bidirectional country-match &amp; merge-tiers logic yang sama seperti fix Python saya.</w:t>
+      </w:r>
+    </w:p>
+    <w:p>
+      <w:pPr>
+        <w:numPr>
+          <w:ilvl w:val="0"/>
+          <w:numId w:val="4"/>
+        </w:numPr>
+      </w:pPr>
+      <w:r>
+        <w:rPr>
+          <w:b/>
+          <w:bCs/>
+        </w:rPr>
+        <w:t>Demand Surcharge (Kritis #3)</w:t>
+      </w:r>
+      <w:r>
+        <w:t xml:space="preserve"> — tabel per-region di calculator.js (BUKAN core.js yang stub — itu sudah dead code, tidak dipanggil sama sekali) sudah </w:t>
+      </w:r>
+      <w:r>
+        <w:rPr>
+          <w:b/>
+          <w:bCs/>
+        </w:rPr>
+        <w:t>identik byte-per-byte</w:t>
+      </w:r>
+      <w:r>
+        <w:t xml:space="preserve"> dengan DEMAND_SURCHARGE_TABLE Python, plus effective-date check (21 Sep 2026) sudah ada.</w:t>
+      </w:r>
+    </w:p>
+    <w:p>
+      <w:pPr>
+        <w:numPr>
+          <w:ilvl w:val="0"/>
+          <w:numId w:val="4"/>
+        </w:numPr>
+      </w:pPr>
+      <w:r>
+        <w:rPr>
+          <w:b/>
+          <w:bCs/>
+        </w:rPr>
+        <w:t>Non-Standard &amp; Special Handling (Kritis #4)</w:t>
+      </w:r>
+      <w:r>
+        <w:t xml:space="preserve"> — nonstandard.js &amp; special_handling.js sudah lengkap, termasuk mutual-exclusivity ODA↔Residential dan DG↔Dry Ice dengan notes yang sama persis kata-katanya seperti fix Python saya sebelumnya.</w:t>
+      </w:r>
+    </w:p>
+    <w:p>
+      <w:pPr>
+        <w:numPr>
+          <w:ilvl w:val="0"/>
+          <w:numId w:val="4"/>
+        </w:numPr>
+      </w:pPr>
+      <w:r>
+        <w:rPr>
+          <w:b/>
+          <w:bCs/>
+        </w:rPr>
+        <w:t>Minimum freight weight 68kg (Sedang #5)</w:t>
+      </w:r>
+      <w:r>
+        <w:t xml:space="preserve"> — MINIMUM_FREIGHT_WEIGHT_KG = 68.0 sudah dipasang &amp; dipakai kondisional per service.</w:t>
+      </w:r>
+    </w:p>
+    <w:p>
+      <w:pPr>
+        <w:numPr>
+          <w:ilvl w:val="0"/>
+          <w:numId w:val="4"/>
+        </w:numPr>
+      </w:pPr>
+      <w:r>
+        <w:rPr>
+          <w:b/>
+          <w:bCs/>
+        </w:rPr>
+        <w:t>pyRound wiring (Rendah)</w:t>
+      </w:r>
+      <w:r>
+        <w:t xml:space="preserve"> — sudah dipakai konsisten di UPS &amp; FedEx calculator.js, bukan Math.round() mentah lagi.</w:t>
+      </w:r>
+    </w:p>
+    <w:p>
+      <w:pPr>
+        <w:pBdr>
+          <w:bottom w:val="single" w:sz="6" w:space="1" w:color="auto"/>
+        </w:pBdr>
+      </w:pPr>
+      <w:r>
+        <w:t>Mau saya langsung perbaiki bug named-group import ini (port ulang direction-aware group logic, sama seperti Python), atau ada bagian lain yang mau diprioritaskan dulu?</w:t>
+      </w:r>
+    </w:p>
+    <w:p>
+      <w:r>
+        <w:t>Sudah diperbaiki &amp; tervalidasi (12 kasus, termasuk semua yang tadinya salah). File yang direvisi:</w:t>
+      </w:r>
+    </w:p>
+    <w:p>
+      <w:pPr>
+        <w:numPr>
+          <w:ilvl w:val="0"/>
+          <w:numId w:val="5"/>
+        </w:numPr>
+      </w:pPr>
+      <w:r>
+        <w:rPr>
+          <w:b/>
+          <w:bCs/>
+        </w:rPr>
+        <w:t>src/carriers/ups/rates/index.js</w:t>
+      </w:r>
+      <w:r>
+        <w:t xml:space="preserve"> — getGroupKey() diganti total jadi direction-aware (persis struktur A26_B26_GROUPS Python), fix mapping China ('china'→'rest of china', bukan 'china'), tambah grup import yang hilang (south korea taiwan vietnam, france germany italy united kingdom, japan sendiri).</w:t>
+      </w:r>
+    </w:p>
+    <w:p>
+      <w:pPr>
+        <w:numPr>
+          <w:ilvl w:val="0"/>
+          <w:numId w:val="5"/>
+        </w:numPr>
+      </w:pPr>
+      <w:r>
+        <w:rPr>
+          <w:b/>
+          <w:bCs/>
+        </w:rPr>
+        <w:t>src/carriers/ups/zones.js</w:t>
+      </w:r>
+      <w:r>
+        <w:t xml:space="preserve"> — tambah effectiveCountryForZone().</w:t>
+      </w:r>
+    </w:p>
+    <w:p>
+      <w:pPr>
+        <w:numPr>
+          <w:ilvl w:val="0"/>
+          <w:numId w:val="5"/>
+        </w:numPr>
+      </w:pPr>
+      <w:r>
+        <w:rPr>
+          <w:b/>
+          <w:bCs/>
+        </w:rPr>
+        <w:t>src/carriers/ups/calculator.js</w:t>
+      </w:r>
+      <w:r>
+        <w:t xml:space="preserve"> — wire fungsi di atas supaya China Southern (kode pos) match ke grup "china south", bukan "rest of china".</w:t>
+      </w:r>
+    </w:p>
+    <w:p>
+      <w:r>
+        <w:t>Zip project (tanpa node_modules/.wrangler/.git biar cepat &amp; kecil — ~1.1MB) sudah saya kirim di atas. Kalau butuh node_modules juga, tinggal npm install di lokal.</w:t>
+      </w:r>
+    </w:p>
+    <w:p>
+      <w:r>
+        <w:t>----------------</w:t>
       </w:r>
     </w:p>
     <w:p/>
@@ -2673,6 +3311,155 @@
 <file path=word/numbering.xml><?xml version="1.0" encoding="utf-8"?>
 <w:numbering xmlns:wpc="http://schemas.microsoft.com/office/word/2010/wordprocessingCanvas" xmlns:cx="http://schemas.microsoft.com/office/drawing/2014/chartex" xmlns:cx1="http://schemas.microsoft.com/office/drawing/2015/9/8/chartex" xmlns:cx2="http://schemas.microsoft.com/office/drawing/2015/10/21/chartex" xmlns:cx3="http://schemas.microsoft.com/office/drawing/2016/5/9/chartex" xmlns:cx4="http://schemas.microsoft.com/office/drawing/2016/5/10/chartex" xmlns:cx5="http://schemas.microsoft.com/office/drawing/2016/5/11/chartex" xmlns:cx6="http://schemas.microsoft.com/office/drawing/2016/5/12/chartex" xmlns:cx7="http://schemas.microsoft.com/office/drawing/2016/5/13/chartex" xmlns:cx8="http://schemas.microsoft.com/office/drawing/2016/5/14/chartex" xmlns:mc="http://schemas.openxmlformats.org/markup-compatibility/2006" xmlns:aink="http://schemas.microsoft.com/office/drawing/2016/ink" xmlns:am3d="http://schemas.microsoft.com/office/drawing/2017/model3d" xmlns:o="urn:schemas-microsoft-com:office:office" xmlns:oel="http://schemas.microsoft.com/office/2019/extlst" xmlns:r="http://schemas.openxmlformats.org/officeDocument/2006/relationships" xmlns:m="http://schemas.openxmlformats.org/officeDocument/2006/math" xmlns:v="urn:schemas-microsoft-com:vml" xmlns:wp14="http://schemas.microsoft.com/office/word/2010/wordprocessingDrawing" xmlns:wp="http://schemas.openxmlformats.org/drawingml/2006/wordprocessingDrawing" xmlns:w10="urn:schemas-microsoft-com:office:word" xmlns:w="http://schemas.openxmlformats.org/wordprocessingml/2006/main" xmlns:w14="http://schemas.microsoft.com/office/word/2010/wordml" xmlns:w15="http://schemas.microsoft.com/office/word/2012/wordml" xmlns:w16cex="http://schemas.microsoft.com/office/word/2018/wordml/cex" xmlns:w16cid="http://schemas.microsoft.com/office/word/2016/wordml/cid" xmlns:w16="http://schemas.microsoft.com/office/word/2018/wordml" xmlns:w16du="http://schemas.microsoft.com/office/word/2023/wordml/word16du" xmlns:w16sdtdh="http://schemas.microsoft.com/office/word/2020/wordml/sdtdatahash" xmlns:w16sdtfl="http://schemas.microsoft.com/office/word/2024/wordml/sdtformatlock" xmlns:w16se="http://schemas.microsoft.com/office/word/2015/wordml/symex" xmlns:wpg="http://schemas.microsoft.com/office/word/2010/wordprocessingGroup" xmlns:wpi="http://schemas.microsoft.com/office/word/2010/wordprocessingInk" xmlns:wne="http://schemas.microsoft.com/office/word/2006/wordml" xmlns:wps="http://schemas.microsoft.com/office/word/2010/wordprocessingShape" mc:Ignorable="w14 w15 w16se w16cid w16 w16cex w16sdtdh w16sdtfl w16du wp14">
   <w:abstractNum w:abstractNumId="0" w15:restartNumberingAfterBreak="0">
+    <w:nsid w:val="0C622F82"/>
+    <w:multiLevelType w:val="multilevel"/>
+    <w:tmpl w:val="B7140836"/>
+    <w:lvl w:ilvl="0">
+      <w:start w:val="1"/>
+      <w:numFmt w:val="bullet"/>
+      <w:lvlText w:val=""/>
+      <w:lvlJc w:val="left"/>
+      <w:pPr>
+        <w:tabs>
+          <w:tab w:val="num" w:pos="720"/>
+        </w:tabs>
+        <w:ind w:left="720" w:hanging="360"/>
+      </w:pPr>
+      <w:rPr>
+        <w:rFonts w:ascii="Symbol" w:hAnsi="Symbol" w:hint="default"/>
+        <w:sz w:val="20"/>
+      </w:rPr>
+    </w:lvl>
+    <w:lvl w:ilvl="1" w:tentative="1">
+      <w:start w:val="1"/>
+      <w:numFmt w:val="bullet"/>
+      <w:lvlText w:val="o"/>
+      <w:lvlJc w:val="left"/>
+      <w:pPr>
+        <w:tabs>
+          <w:tab w:val="num" w:pos="1440"/>
+        </w:tabs>
+        <w:ind w:left="1440" w:hanging="360"/>
+      </w:pPr>
+      <w:rPr>
+        <w:rFonts w:ascii="Courier New" w:hAnsi="Courier New" w:hint="default"/>
+        <w:sz w:val="20"/>
+      </w:rPr>
+    </w:lvl>
+    <w:lvl w:ilvl="2" w:tentative="1">
+      <w:start w:val="1"/>
+      <w:numFmt w:val="bullet"/>
+      <w:lvlText w:val=""/>
+      <w:lvlJc w:val="left"/>
+      <w:pPr>
+        <w:tabs>
+          <w:tab w:val="num" w:pos="2160"/>
+        </w:tabs>
+        <w:ind w:left="2160" w:hanging="360"/>
+      </w:pPr>
+      <w:rPr>
+        <w:rFonts w:ascii="Wingdings" w:hAnsi="Wingdings" w:hint="default"/>
+        <w:sz w:val="20"/>
+      </w:rPr>
+    </w:lvl>
+    <w:lvl w:ilvl="3" w:tentative="1">
+      <w:start w:val="1"/>
+      <w:numFmt w:val="bullet"/>
+      <w:lvlText w:val=""/>
+      <w:lvlJc w:val="left"/>
+      <w:pPr>
+        <w:tabs>
+          <w:tab w:val="num" w:pos="2880"/>
+        </w:tabs>
+        <w:ind w:left="2880" w:hanging="360"/>
+      </w:pPr>
+      <w:rPr>
+        <w:rFonts w:ascii="Wingdings" w:hAnsi="Wingdings" w:hint="default"/>
+        <w:sz w:val="20"/>
+      </w:rPr>
+    </w:lvl>
+    <w:lvl w:ilvl="4" w:tentative="1">
+      <w:start w:val="1"/>
+      <w:numFmt w:val="bullet"/>
+      <w:lvlText w:val=""/>
+      <w:lvlJc w:val="left"/>
+      <w:pPr>
+        <w:tabs>
+          <w:tab w:val="num" w:pos="3600"/>
+        </w:tabs>
+        <w:ind w:left="3600" w:hanging="360"/>
+      </w:pPr>
+      <w:rPr>
+        <w:rFonts w:ascii="Wingdings" w:hAnsi="Wingdings" w:hint="default"/>
+        <w:sz w:val="20"/>
+      </w:rPr>
+    </w:lvl>
+    <w:lvl w:ilvl="5" w:tentative="1">
+      <w:start w:val="1"/>
+      <w:numFmt w:val="bullet"/>
+      <w:lvlText w:val=""/>
+      <w:lvlJc w:val="left"/>
+      <w:pPr>
+        <w:tabs>
+          <w:tab w:val="num" w:pos="4320"/>
+        </w:tabs>
+        <w:ind w:left="4320" w:hanging="360"/>
+      </w:pPr>
+      <w:rPr>
+        <w:rFonts w:ascii="Wingdings" w:hAnsi="Wingdings" w:hint="default"/>
+        <w:sz w:val="20"/>
+      </w:rPr>
+    </w:lvl>
+    <w:lvl w:ilvl="6" w:tentative="1">
+      <w:start w:val="1"/>
+      <w:numFmt w:val="bullet"/>
+      <w:lvlText w:val=""/>
+      <w:lvlJc w:val="left"/>
+      <w:pPr>
+        <w:tabs>
+          <w:tab w:val="num" w:pos="5040"/>
+        </w:tabs>
+        <w:ind w:left="5040" w:hanging="360"/>
+      </w:pPr>
+      <w:rPr>
+        <w:rFonts w:ascii="Wingdings" w:hAnsi="Wingdings" w:hint="default"/>
+        <w:sz w:val="20"/>
+      </w:rPr>
+    </w:lvl>
+    <w:lvl w:ilvl="7" w:tentative="1">
+      <w:start w:val="1"/>
+      <w:numFmt w:val="bullet"/>
+      <w:lvlText w:val=""/>
+      <w:lvlJc w:val="left"/>
+      <w:pPr>
+        <w:tabs>
+          <w:tab w:val="num" w:pos="5760"/>
+        </w:tabs>
+        <w:ind w:left="5760" w:hanging="360"/>
+      </w:pPr>
+      <w:rPr>
+        <w:rFonts w:ascii="Wingdings" w:hAnsi="Wingdings" w:hint="default"/>
+        <w:sz w:val="20"/>
+      </w:rPr>
+    </w:lvl>
+    <w:lvl w:ilvl="8" w:tentative="1">
+      <w:start w:val="1"/>
+      <w:numFmt w:val="bullet"/>
+      <w:lvlText w:val=""/>
+      <w:lvlJc w:val="left"/>
+      <w:pPr>
+        <w:tabs>
+          <w:tab w:val="num" w:pos="6480"/>
+        </w:tabs>
+        <w:ind w:left="6480" w:hanging="360"/>
+      </w:pPr>
+      <w:rPr>
+        <w:rFonts w:ascii="Wingdings" w:hAnsi="Wingdings" w:hint="default"/>
+        <w:sz w:val="20"/>
+      </w:rPr>
+    </w:lvl>
+  </w:abstractNum>
+  <w:abstractNum w:abstractNumId="1" w15:restartNumberingAfterBreak="0">
     <w:nsid w:val="174A3317"/>
     <w:multiLevelType w:val="multilevel"/>
     <w:tmpl w:val="5E2C4B8E"/>
@@ -2793,7 +3580,120 @@
       </w:pPr>
     </w:lvl>
   </w:abstractNum>
-  <w:abstractNum w:abstractNumId="1" w15:restartNumberingAfterBreak="0">
+  <w:abstractNum w:abstractNumId="2" w15:restartNumberingAfterBreak="0">
+    <w:nsid w:val="282A7B79"/>
+    <w:multiLevelType w:val="multilevel"/>
+    <w:tmpl w:val="34AE5770"/>
+    <w:lvl w:ilvl="0">
+      <w:start w:val="1"/>
+      <w:numFmt w:val="decimal"/>
+      <w:lvlText w:val="%1."/>
+      <w:lvlJc w:val="left"/>
+      <w:pPr>
+        <w:tabs>
+          <w:tab w:val="num" w:pos="720"/>
+        </w:tabs>
+        <w:ind w:left="720" w:hanging="360"/>
+      </w:pPr>
+    </w:lvl>
+    <w:lvl w:ilvl="1" w:tentative="1">
+      <w:start w:val="1"/>
+      <w:numFmt w:val="decimal"/>
+      <w:lvlText w:val="%2."/>
+      <w:lvlJc w:val="left"/>
+      <w:pPr>
+        <w:tabs>
+          <w:tab w:val="num" w:pos="1440"/>
+        </w:tabs>
+        <w:ind w:left="1440" w:hanging="360"/>
+      </w:pPr>
+    </w:lvl>
+    <w:lvl w:ilvl="2" w:tentative="1">
+      <w:start w:val="1"/>
+      <w:numFmt w:val="decimal"/>
+      <w:lvlText w:val="%3."/>
+      <w:lvlJc w:val="left"/>
+      <w:pPr>
+        <w:tabs>
+          <w:tab w:val="num" w:pos="2160"/>
+        </w:tabs>
+        <w:ind w:left="2160" w:hanging="360"/>
+      </w:pPr>
+    </w:lvl>
+    <w:lvl w:ilvl="3" w:tentative="1">
+      <w:start w:val="1"/>
+      <w:numFmt w:val="decimal"/>
+      <w:lvlText w:val="%4."/>
+      <w:lvlJc w:val="left"/>
+      <w:pPr>
+        <w:tabs>
+          <w:tab w:val="num" w:pos="2880"/>
+        </w:tabs>
+        <w:ind w:left="2880" w:hanging="360"/>
+      </w:pPr>
+    </w:lvl>
+    <w:lvl w:ilvl="4" w:tentative="1">
+      <w:start w:val="1"/>
+      <w:numFmt w:val="decimal"/>
+      <w:lvlText w:val="%5."/>
+      <w:lvlJc w:val="left"/>
+      <w:pPr>
+        <w:tabs>
+          <w:tab w:val="num" w:pos="3600"/>
+        </w:tabs>
+        <w:ind w:left="3600" w:hanging="360"/>
+      </w:pPr>
+    </w:lvl>
+    <w:lvl w:ilvl="5" w:tentative="1">
+      <w:start w:val="1"/>
+      <w:numFmt w:val="decimal"/>
+      <w:lvlText w:val="%6."/>
+      <w:lvlJc w:val="left"/>
+      <w:pPr>
+        <w:tabs>
+          <w:tab w:val="num" w:pos="4320"/>
+        </w:tabs>
+        <w:ind w:left="4320" w:hanging="360"/>
+      </w:pPr>
+    </w:lvl>
+    <w:lvl w:ilvl="6" w:tentative="1">
+      <w:start w:val="1"/>
+      <w:numFmt w:val="decimal"/>
+      <w:lvlText w:val="%7."/>
+      <w:lvlJc w:val="left"/>
+      <w:pPr>
+        <w:tabs>
+          <w:tab w:val="num" w:pos="5040"/>
+        </w:tabs>
+        <w:ind w:left="5040" w:hanging="360"/>
+      </w:pPr>
+    </w:lvl>
+    <w:lvl w:ilvl="7" w:tentative="1">
+      <w:start w:val="1"/>
+      <w:numFmt w:val="decimal"/>
+      <w:lvlText w:val="%8."/>
+      <w:lvlJc w:val="left"/>
+      <w:pPr>
+        <w:tabs>
+          <w:tab w:val="num" w:pos="5760"/>
+        </w:tabs>
+        <w:ind w:left="5760" w:hanging="360"/>
+      </w:pPr>
+    </w:lvl>
+    <w:lvl w:ilvl="8" w:tentative="1">
+      <w:start w:val="1"/>
+      <w:numFmt w:val="decimal"/>
+      <w:lvlText w:val="%9."/>
+      <w:lvlJc w:val="left"/>
+      <w:pPr>
+        <w:tabs>
+          <w:tab w:val="num" w:pos="6480"/>
+        </w:tabs>
+        <w:ind w:left="6480" w:hanging="360"/>
+      </w:pPr>
+    </w:lvl>
+  </w:abstractNum>
+  <w:abstractNum w:abstractNumId="3" w15:restartNumberingAfterBreak="0">
     <w:nsid w:val="5EA1134D"/>
     <w:multiLevelType w:val="multilevel"/>
     <w:tmpl w:val="6026F110"/>
@@ -2942,7 +3842,7 @@
       </w:rPr>
     </w:lvl>
   </w:abstractNum>
-  <w:abstractNum w:abstractNumId="2" w15:restartNumberingAfterBreak="0">
+  <w:abstractNum w:abstractNumId="4" w15:restartNumberingAfterBreak="0">
     <w:nsid w:val="6164101C"/>
     <w:multiLevelType w:val="multilevel"/>
     <w:tmpl w:val="70F6EEF8"/>
@@ -3060,13 +3960,19 @@
     </w:lvl>
   </w:abstractNum>
   <w:num w:numId="1" w16cid:durableId="1051881720">
+    <w:abstractNumId w:val="3"/>
+  </w:num>
+  <w:num w:numId="2" w16cid:durableId="382290068">
+    <w:abstractNumId w:val="4"/>
+  </w:num>
+  <w:num w:numId="3" w16cid:durableId="60953454">
     <w:abstractNumId w:val="1"/>
   </w:num>
-  <w:num w:numId="2" w16cid:durableId="382290068">
+  <w:num w:numId="4" w16cid:durableId="1097366121">
+    <w:abstractNumId w:val="0"/>
+  </w:num>
+  <w:num w:numId="5" w16cid:durableId="1537817608">
     <w:abstractNumId w:val="2"/>
-  </w:num>
-  <w:num w:numId="3" w16cid:durableId="60953454">
-    <w:abstractNumId w:val="0"/>
   </w:num>
 </w:numbering>
 </file>

</xml_diff>

<commit_message>
Fix FedEx service switch and notes
</commit_message>
<xml_diff>
--- a/Hasil temuan audit cluade 12 sep26 9.49.docx
+++ b/Hasil temuan audit cluade 12 sep26 9.49.docx
@@ -3288,13 +3288,179 @@
       </w:r>
     </w:p>
     <w:p>
+      <w:pPr>
+        <w:pBdr>
+          <w:bottom w:val="single" w:sz="6" w:space="1" w:color="auto"/>
+        </w:pBdr>
+      </w:pPr>
       <w:r>
         <w:t>Zip project (tanpa node_modules/.wrangler/.git biar cepat &amp; kecil — ~1.1MB) sudah saya kirim di atas. Kalau butuh node_modules juga, tinggal npm install di lokal.</w:t>
       </w:r>
     </w:p>
-    <w:p>
-      <w:r>
-        <w:t>----------------</w:t>
+    <w:p/>
+    <w:p>
+      <w:r>
+        <w:t>Temuan audit baru</w:t>
+      </w:r>
+    </w:p>
+    <w:p/>
+    <w:p>
+      <w:r>
+        <w:rPr>
+          <w:b/>
+          <w:bCs/>
+        </w:rPr>
+        <w:t>Root cause:</w:t>
+      </w:r>
+      <w:r>
+        <w:t xml:space="preserve"> dengan input 52×50×90cm, Length+Girth = 52 + 2×50 + 2×90 = </w:t>
+      </w:r>
+      <w:r>
+        <w:rPr>
+          <w:b/>
+          <w:bCs/>
+        </w:rPr>
+        <w:t>332cm</w:t>
+      </w:r>
+      <w:r>
+        <w:t xml:space="preserve"> (&gt;330cm), jadi memang wajib pindah ke IPF/IEF. Logic pengecekannya (checkServiceEligibility) sebenarnya </w:t>
+      </w:r>
+      <w:r>
+        <w:rPr>
+          <w:b/>
+          <w:bCs/>
+        </w:rPr>
+        <w:lastRenderedPageBreak/>
+        <w:t>sudah ada</w:t>
+      </w:r>
+      <w:r>
+        <w:t xml:space="preserve"> di kode JS sejak sebelumnya, tapi </w:t>
+      </w:r>
+      <w:r>
+        <w:rPr>
+          <w:b/>
+          <w:bCs/>
+        </w:rPr>
+        <w:t>tidak pernah dipanggil</w:t>
+      </w:r>
+      <w:r>
+        <w:t xml:space="preserve"> dari calculator.js — jadi service selalu diam di IP/IE berapapun besar dimensinya.</w:t>
+      </w:r>
+    </w:p>
+    <w:p>
+      <w:r>
+        <w:t xml:space="preserve">Sekaligus ketemu bug kedua yang berkaitan: field notes di hasil akhir itu </w:t>
+      </w:r>
+      <w:r>
+        <w:rPr>
+          <w:b/>
+          <w:bCs/>
+        </w:rPr>
+        <w:t>hardcoded</w:t>
+      </w:r>
+      <w:r>
+        <w:t>, isinya cuma dicek status Demand Surcharge, jadi semua notes lain (termasuk alasan auto-switch, alasan Oversize Charge, dll.) hilang diam-diam dari output — meski logikanya sudah jalan di internal.</w:t>
+      </w:r>
+    </w:p>
+    <w:p>
+      <w:r>
+        <w:rPr>
+          <w:b/>
+          <w:bCs/>
+        </w:rPr>
+        <w:t>File yang direvisi:</w:t>
+      </w:r>
+    </w:p>
+    <w:p>
+      <w:pPr>
+        <w:numPr>
+          <w:ilvl w:val="0"/>
+          <w:numId w:val="6"/>
+        </w:numPr>
+      </w:pPr>
+      <w:r>
+        <w:t>src/carriers/fedex/surcharges/nonstandard.js — tambah evaluatePackagesForServiceSwitch() (port dari Python evaluate_packages_for_service_switch(), termasuk ShipmentSplitRequired).</w:t>
+      </w:r>
+    </w:p>
+    <w:p>
+      <w:pPr>
+        <w:numPr>
+          <w:ilvl w:val="0"/>
+          <w:numId w:val="6"/>
+        </w:numPr>
+      </w:pPr>
+      <w:r>
+        <w:t>src/carriers/fedex/calculator.js — wire fungsi itu (auto-switch IP/IE→IPF/IEF sebelum hitung CWT), plus fix notes supaya pakai array yang beneran terkumpul, bukan hardcode.</w:t>
+      </w:r>
+    </w:p>
+    <w:p>
+      <w:r>
+        <w:rPr>
+          <w:b/>
+          <w:bCs/>
+        </w:rPr>
+        <w:t>Tervalidasi</w:t>
+      </w:r>
+      <w:r>
+        <w:t xml:space="preserve"> (3 skenario, cocok 100% dengan Python):</w:t>
+      </w:r>
+    </w:p>
+    <w:p>
+      <w:pPr>
+        <w:numPr>
+          <w:ilvl w:val="0"/>
+          <w:numId w:val="7"/>
+        </w:numPr>
+      </w:pPr>
+      <w:r>
+        <w:t xml:space="preserve">Dims 52×50×90cm, auto_switch_service default → </w:t>
+      </w:r>
+      <w:r>
+        <w:rPr>
+          <w:b/>
+          <w:bCs/>
+        </w:rPr>
+        <w:t>auto-switch ke IPF</w:t>
+      </w:r>
+      <w:r>
+        <w:t>, base price Rp 31.824.000, notes jelasin alasannya.</w:t>
+      </w:r>
+    </w:p>
+    <w:p>
+      <w:pPr>
+        <w:numPr>
+          <w:ilvl w:val="0"/>
+          <w:numId w:val="7"/>
+        </w:numPr>
+      </w:pPr>
+      <w:r>
+        <w:t xml:space="preserve">Sama tapi auto_switch_service: false → tetap IP, </w:t>
+      </w:r>
+      <w:r>
+        <w:rPr>
+          <w:b/>
+          <w:bCs/>
+        </w:rPr>
+        <w:t>Oversize Charge Rp 1.072.000</w:t>
+      </w:r>
+      <w:r>
+        <w:t xml:space="preserve"> muncul.</w:t>
+      </w:r>
+    </w:p>
+    <w:p>
+      <w:pPr>
+        <w:numPr>
+          <w:ilvl w:val="0"/>
+          <w:numId w:val="7"/>
+        </w:numPr>
+      </w:pPr>
+      <w:r>
+        <w:t>Dims dalam batas (30×20×20cm) → tetap IP, tidak ada surcharge — tidak ada regresi.</w:t>
+      </w:r>
+    </w:p>
+    <w:p>
+      <w:r>
+        <w:t>--------------</w:t>
       </w:r>
     </w:p>
     <w:p/>
@@ -3694,6 +3860,119 @@
     </w:lvl>
   </w:abstractNum>
   <w:abstractNum w:abstractNumId="3" w15:restartNumberingAfterBreak="0">
+    <w:nsid w:val="53F523FE"/>
+    <w:multiLevelType w:val="multilevel"/>
+    <w:tmpl w:val="ECC86328"/>
+    <w:lvl w:ilvl="0">
+      <w:start w:val="1"/>
+      <w:numFmt w:val="decimal"/>
+      <w:lvlText w:val="%1."/>
+      <w:lvlJc w:val="left"/>
+      <w:pPr>
+        <w:tabs>
+          <w:tab w:val="num" w:pos="720"/>
+        </w:tabs>
+        <w:ind w:left="720" w:hanging="360"/>
+      </w:pPr>
+    </w:lvl>
+    <w:lvl w:ilvl="1" w:tentative="1">
+      <w:start w:val="1"/>
+      <w:numFmt w:val="decimal"/>
+      <w:lvlText w:val="%2."/>
+      <w:lvlJc w:val="left"/>
+      <w:pPr>
+        <w:tabs>
+          <w:tab w:val="num" w:pos="1440"/>
+        </w:tabs>
+        <w:ind w:left="1440" w:hanging="360"/>
+      </w:pPr>
+    </w:lvl>
+    <w:lvl w:ilvl="2" w:tentative="1">
+      <w:start w:val="1"/>
+      <w:numFmt w:val="decimal"/>
+      <w:lvlText w:val="%3."/>
+      <w:lvlJc w:val="left"/>
+      <w:pPr>
+        <w:tabs>
+          <w:tab w:val="num" w:pos="2160"/>
+        </w:tabs>
+        <w:ind w:left="2160" w:hanging="360"/>
+      </w:pPr>
+    </w:lvl>
+    <w:lvl w:ilvl="3" w:tentative="1">
+      <w:start w:val="1"/>
+      <w:numFmt w:val="decimal"/>
+      <w:lvlText w:val="%4."/>
+      <w:lvlJc w:val="left"/>
+      <w:pPr>
+        <w:tabs>
+          <w:tab w:val="num" w:pos="2880"/>
+        </w:tabs>
+        <w:ind w:left="2880" w:hanging="360"/>
+      </w:pPr>
+    </w:lvl>
+    <w:lvl w:ilvl="4" w:tentative="1">
+      <w:start w:val="1"/>
+      <w:numFmt w:val="decimal"/>
+      <w:lvlText w:val="%5."/>
+      <w:lvlJc w:val="left"/>
+      <w:pPr>
+        <w:tabs>
+          <w:tab w:val="num" w:pos="3600"/>
+        </w:tabs>
+        <w:ind w:left="3600" w:hanging="360"/>
+      </w:pPr>
+    </w:lvl>
+    <w:lvl w:ilvl="5" w:tentative="1">
+      <w:start w:val="1"/>
+      <w:numFmt w:val="decimal"/>
+      <w:lvlText w:val="%6."/>
+      <w:lvlJc w:val="left"/>
+      <w:pPr>
+        <w:tabs>
+          <w:tab w:val="num" w:pos="4320"/>
+        </w:tabs>
+        <w:ind w:left="4320" w:hanging="360"/>
+      </w:pPr>
+    </w:lvl>
+    <w:lvl w:ilvl="6" w:tentative="1">
+      <w:start w:val="1"/>
+      <w:numFmt w:val="decimal"/>
+      <w:lvlText w:val="%7."/>
+      <w:lvlJc w:val="left"/>
+      <w:pPr>
+        <w:tabs>
+          <w:tab w:val="num" w:pos="5040"/>
+        </w:tabs>
+        <w:ind w:left="5040" w:hanging="360"/>
+      </w:pPr>
+    </w:lvl>
+    <w:lvl w:ilvl="7" w:tentative="1">
+      <w:start w:val="1"/>
+      <w:numFmt w:val="decimal"/>
+      <w:lvlText w:val="%8."/>
+      <w:lvlJc w:val="left"/>
+      <w:pPr>
+        <w:tabs>
+          <w:tab w:val="num" w:pos="5760"/>
+        </w:tabs>
+        <w:ind w:left="5760" w:hanging="360"/>
+      </w:pPr>
+    </w:lvl>
+    <w:lvl w:ilvl="8" w:tentative="1">
+      <w:start w:val="1"/>
+      <w:numFmt w:val="decimal"/>
+      <w:lvlText w:val="%9."/>
+      <w:lvlJc w:val="left"/>
+      <w:pPr>
+        <w:tabs>
+          <w:tab w:val="num" w:pos="6480"/>
+        </w:tabs>
+        <w:ind w:left="6480" w:hanging="360"/>
+      </w:pPr>
+    </w:lvl>
+  </w:abstractNum>
+  <w:abstractNum w:abstractNumId="4" w15:restartNumberingAfterBreak="0">
     <w:nsid w:val="5EA1134D"/>
     <w:multiLevelType w:val="multilevel"/>
     <w:tmpl w:val="6026F110"/>
@@ -3842,7 +4121,7 @@
       </w:rPr>
     </w:lvl>
   </w:abstractNum>
-  <w:abstractNum w:abstractNumId="4" w15:restartNumberingAfterBreak="0">
+  <w:abstractNum w:abstractNumId="5" w15:restartNumberingAfterBreak="0">
     <w:nsid w:val="6164101C"/>
     <w:multiLevelType w:val="multilevel"/>
     <w:tmpl w:val="70F6EEF8"/>
@@ -3959,11 +4238,160 @@
       </w:pPr>
     </w:lvl>
   </w:abstractNum>
+  <w:abstractNum w:abstractNumId="6" w15:restartNumberingAfterBreak="0">
+    <w:nsid w:val="6F01549E"/>
+    <w:multiLevelType w:val="multilevel"/>
+    <w:tmpl w:val="12EEB9E6"/>
+    <w:lvl w:ilvl="0">
+      <w:start w:val="1"/>
+      <w:numFmt w:val="bullet"/>
+      <w:lvlText w:val=""/>
+      <w:lvlJc w:val="left"/>
+      <w:pPr>
+        <w:tabs>
+          <w:tab w:val="num" w:pos="720"/>
+        </w:tabs>
+        <w:ind w:left="720" w:hanging="360"/>
+      </w:pPr>
+      <w:rPr>
+        <w:rFonts w:ascii="Symbol" w:hAnsi="Symbol" w:hint="default"/>
+        <w:sz w:val="20"/>
+      </w:rPr>
+    </w:lvl>
+    <w:lvl w:ilvl="1" w:tentative="1">
+      <w:start w:val="1"/>
+      <w:numFmt w:val="bullet"/>
+      <w:lvlText w:val="o"/>
+      <w:lvlJc w:val="left"/>
+      <w:pPr>
+        <w:tabs>
+          <w:tab w:val="num" w:pos="1440"/>
+        </w:tabs>
+        <w:ind w:left="1440" w:hanging="360"/>
+      </w:pPr>
+      <w:rPr>
+        <w:rFonts w:ascii="Courier New" w:hAnsi="Courier New" w:hint="default"/>
+        <w:sz w:val="20"/>
+      </w:rPr>
+    </w:lvl>
+    <w:lvl w:ilvl="2" w:tentative="1">
+      <w:start w:val="1"/>
+      <w:numFmt w:val="bullet"/>
+      <w:lvlText w:val=""/>
+      <w:lvlJc w:val="left"/>
+      <w:pPr>
+        <w:tabs>
+          <w:tab w:val="num" w:pos="2160"/>
+        </w:tabs>
+        <w:ind w:left="2160" w:hanging="360"/>
+      </w:pPr>
+      <w:rPr>
+        <w:rFonts w:ascii="Wingdings" w:hAnsi="Wingdings" w:hint="default"/>
+        <w:sz w:val="20"/>
+      </w:rPr>
+    </w:lvl>
+    <w:lvl w:ilvl="3" w:tentative="1">
+      <w:start w:val="1"/>
+      <w:numFmt w:val="bullet"/>
+      <w:lvlText w:val=""/>
+      <w:lvlJc w:val="left"/>
+      <w:pPr>
+        <w:tabs>
+          <w:tab w:val="num" w:pos="2880"/>
+        </w:tabs>
+        <w:ind w:left="2880" w:hanging="360"/>
+      </w:pPr>
+      <w:rPr>
+        <w:rFonts w:ascii="Wingdings" w:hAnsi="Wingdings" w:hint="default"/>
+        <w:sz w:val="20"/>
+      </w:rPr>
+    </w:lvl>
+    <w:lvl w:ilvl="4" w:tentative="1">
+      <w:start w:val="1"/>
+      <w:numFmt w:val="bullet"/>
+      <w:lvlText w:val=""/>
+      <w:lvlJc w:val="left"/>
+      <w:pPr>
+        <w:tabs>
+          <w:tab w:val="num" w:pos="3600"/>
+        </w:tabs>
+        <w:ind w:left="3600" w:hanging="360"/>
+      </w:pPr>
+      <w:rPr>
+        <w:rFonts w:ascii="Wingdings" w:hAnsi="Wingdings" w:hint="default"/>
+        <w:sz w:val="20"/>
+      </w:rPr>
+    </w:lvl>
+    <w:lvl w:ilvl="5" w:tentative="1">
+      <w:start w:val="1"/>
+      <w:numFmt w:val="bullet"/>
+      <w:lvlText w:val=""/>
+      <w:lvlJc w:val="left"/>
+      <w:pPr>
+        <w:tabs>
+          <w:tab w:val="num" w:pos="4320"/>
+        </w:tabs>
+        <w:ind w:left="4320" w:hanging="360"/>
+      </w:pPr>
+      <w:rPr>
+        <w:rFonts w:ascii="Wingdings" w:hAnsi="Wingdings" w:hint="default"/>
+        <w:sz w:val="20"/>
+      </w:rPr>
+    </w:lvl>
+    <w:lvl w:ilvl="6" w:tentative="1">
+      <w:start w:val="1"/>
+      <w:numFmt w:val="bullet"/>
+      <w:lvlText w:val=""/>
+      <w:lvlJc w:val="left"/>
+      <w:pPr>
+        <w:tabs>
+          <w:tab w:val="num" w:pos="5040"/>
+        </w:tabs>
+        <w:ind w:left="5040" w:hanging="360"/>
+      </w:pPr>
+      <w:rPr>
+        <w:rFonts w:ascii="Wingdings" w:hAnsi="Wingdings" w:hint="default"/>
+        <w:sz w:val="20"/>
+      </w:rPr>
+    </w:lvl>
+    <w:lvl w:ilvl="7" w:tentative="1">
+      <w:start w:val="1"/>
+      <w:numFmt w:val="bullet"/>
+      <w:lvlText w:val=""/>
+      <w:lvlJc w:val="left"/>
+      <w:pPr>
+        <w:tabs>
+          <w:tab w:val="num" w:pos="5760"/>
+        </w:tabs>
+        <w:ind w:left="5760" w:hanging="360"/>
+      </w:pPr>
+      <w:rPr>
+        <w:rFonts w:ascii="Wingdings" w:hAnsi="Wingdings" w:hint="default"/>
+        <w:sz w:val="20"/>
+      </w:rPr>
+    </w:lvl>
+    <w:lvl w:ilvl="8" w:tentative="1">
+      <w:start w:val="1"/>
+      <w:numFmt w:val="bullet"/>
+      <w:lvlText w:val=""/>
+      <w:lvlJc w:val="left"/>
+      <w:pPr>
+        <w:tabs>
+          <w:tab w:val="num" w:pos="6480"/>
+        </w:tabs>
+        <w:ind w:left="6480" w:hanging="360"/>
+      </w:pPr>
+      <w:rPr>
+        <w:rFonts w:ascii="Wingdings" w:hAnsi="Wingdings" w:hint="default"/>
+        <w:sz w:val="20"/>
+      </w:rPr>
+    </w:lvl>
+  </w:abstractNum>
   <w:num w:numId="1" w16cid:durableId="1051881720">
-    <w:abstractNumId w:val="3"/>
+    <w:abstractNumId w:val="4"/>
   </w:num>
   <w:num w:numId="2" w16cid:durableId="382290068">
-    <w:abstractNumId w:val="4"/>
+    <w:abstractNumId w:val="5"/>
   </w:num>
   <w:num w:numId="3" w16cid:durableId="60953454">
     <w:abstractNumId w:val="1"/>
@@ -3973,6 +4401,12 @@
   </w:num>
   <w:num w:numId="5" w16cid:durableId="1537817608">
     <w:abstractNumId w:val="2"/>
+  </w:num>
+  <w:num w:numId="6" w16cid:durableId="1068383738">
+    <w:abstractNumId w:val="3"/>
+  </w:num>
+  <w:num w:numId="7" w16cid:durableId="578371344">
+    <w:abstractNumId w:val="6"/>
   </w:num>
 </w:numbering>
 </file>

</xml_diff>